<commit_message>
docs: config-labeled training curves + figure↔config↔wandb legend + wandb replay
- analyze_grpo.py: --title / --panels; regenerate curves with config-rich legends
- results/figure_legend.md: every curve ↔ exact config ↔ wandb run id
- scripts/wandb_replay.py: replay console-log metrics into wandb (runs used console logger)
- rebuild 报告.docx with config-labeled figures

Co-Authored-By: Claude Opus 4.8 (1M context) <noreply@anthropic.com>
</commit_message>
<xml_diff>
--- a/报告.docx
+++ b/报告.docx
@@ -6513,7 +6513,7 @@
       <w:r>
         <w:drawing>
           <wp:inline>
-            <wp:extent cx="5334000" cy="3556000"/>
+            <wp:extent cx="5334000" cy="3487615"/>
             <wp:effectExtent b="0" l="0" r="0" t="0"/>
             <wp:docPr descr="图1 纯 GRPO vs SFT→GRPO 训练曲线（critic/score/mean 与 val/test_score vs step）" title="" id="29" name="Picture"/>
             <a:graphic>
@@ -6534,7 +6534,7 @@
                   <pic:spPr bwMode="auto">
                     <a:xfrm>
                       <a:off x="0" y="0"/>
-                      <a:ext cx="5334000" cy="3556000"/>
+                      <a:ext cx="5334000" cy="3487615"/>
                     </a:xfrm>
                     <a:prstGeom prst="rect">
                       <a:avLst/>
@@ -6607,7 +6607,7 @@
       <w:r>
         <w:drawing>
           <wp:inline>
-            <wp:extent cx="5334000" cy="3556000"/>
+            <wp:extent cx="5334000" cy="3487615"/>
             <wp:effectExtent b="0" l="0" r="0" t="0"/>
             <wp:docPr descr="图2 奖励设计消融的训练奖励曲线（sparse / shaped / staged）" title="" id="32" name="Picture"/>
             <a:graphic>
@@ -6628,7 +6628,7 @@
                   <pic:spPr bwMode="auto">
                     <a:xfrm>
                       <a:off x="0" y="0"/>
-                      <a:ext cx="5334000" cy="3556000"/>
+                      <a:ext cx="5334000" cy="3487615"/>
                     </a:xfrm>
                     <a:prstGeom prst="rect">
                       <a:avLst/>
@@ -6683,7 +6683,7 @@
       <w:r>
         <w:drawing>
           <wp:inline>
-            <wp:extent cx="5334000" cy="3556000"/>
+            <wp:extent cx="5334000" cy="3487615"/>
             <wp:effectExtent b="0" l="0" r="0" t="0"/>
             <wp:docPr descr="图3 策略熵曲线：GRPO 使熵下降（多样性坍缩的机制）；高 KL/高熵配置衰减更慢" title="" id="35" name="Picture"/>
             <a:graphic>
@@ -6704,7 +6704,7 @@
                   <pic:spPr bwMode="auto">
                     <a:xfrm>
                       <a:off x="0" y="0"/>
-                      <a:ext cx="5334000" cy="3556000"/>
+                      <a:ext cx="5334000" cy="3487615"/>
                     </a:xfrm>
                     <a:prstGeom prst="rect">
                       <a:avLst/>

</xml_diff>